<commit_message>
Complete practical works 1–6 using updated manual
Co-authored-by: arena-agent <297053741+arena-agent@users.noreply.github.com>
</commit_message>
<xml_diff>
--- a/Практическая_работа_2_Отчет.docx
+++ b/Практическая_работа_2_Отчет.docx
@@ -5,18 +5,16 @@
     <w:p>
       <w:pPr>
         <w:keepNext w:val="0"/>
-        <w:spacing w:line="360" w:lineRule="auto" w:before="0" w:after="0"/>
-        <w:ind w:firstLine="0" w:left="0" w:right="0"/>
+        <w:spacing w:before="0" w:after="0"/>
+        <w:ind w:firstLine="0"/>
         <w:jc w:val="center"/>
       </w:pPr>
       <w:r>
         <w:rPr>
-          <w:rFonts w:ascii="Times New Roman" w:hAnsi="Times New Roman" w:cs="Times New Roman" w:eastAsia="Times New Roman"/>
+          <w:rFonts w:ascii="Times New Roman" w:hAnsi="Times New Roman" w:eastAsia="Times New Roman"/>
           <w:b w:val="0"/>
-          <w:i w:val="0"/>
           <w:color w:val="000000"/>
           <w:sz w:val="28"/>
-          <w:lang w:val="ru-RU"/>
         </w:rPr>
         <w:t>МИНИСТЕРСТВО ПРОСВЕЩЕНИЯ</w:t>
         <w:br/>
@@ -26,18 +24,16 @@
     <w:p>
       <w:pPr>
         <w:keepNext w:val="0"/>
-        <w:spacing w:line="360" w:lineRule="auto" w:before="0" w:after="0"/>
-        <w:ind w:firstLine="0" w:left="0" w:right="0"/>
+        <w:spacing w:before="0" w:after="0"/>
+        <w:ind w:firstLine="0"/>
         <w:jc w:val="center"/>
       </w:pPr>
       <w:r>
         <w:rPr>
-          <w:rFonts w:ascii="Times New Roman" w:hAnsi="Times New Roman" w:cs="Times New Roman" w:eastAsia="Times New Roman"/>
+          <w:rFonts w:ascii="Times New Roman" w:hAnsi="Times New Roman" w:eastAsia="Times New Roman"/>
           <w:b w:val="0"/>
-          <w:i w:val="0"/>
           <w:color w:val="000000"/>
           <w:sz w:val="28"/>
-          <w:lang w:val="ru-RU"/>
         </w:rPr>
         <w:t>________________________________________</w:t>
         <w:br/>
@@ -47,18 +43,16 @@
     <w:p>
       <w:pPr>
         <w:keepNext w:val="0"/>
-        <w:spacing w:line="360" w:lineRule="auto" w:before="0" w:after="0"/>
-        <w:ind w:firstLine="0" w:left="0" w:right="0"/>
+        <w:spacing w:before="0" w:after="480"/>
+        <w:ind w:firstLine="0"/>
         <w:jc w:val="center"/>
       </w:pPr>
       <w:r>
         <w:rPr>
-          <w:rFonts w:ascii="Times New Roman" w:hAnsi="Times New Roman" w:cs="Times New Roman" w:eastAsia="Times New Roman"/>
+          <w:rFonts w:ascii="Times New Roman" w:hAnsi="Times New Roman" w:eastAsia="Times New Roman"/>
           <w:b w:val="0"/>
-          <w:i w:val="0"/>
           <w:color w:val="000000"/>
           <w:sz w:val="28"/>
-          <w:lang w:val="ru-RU"/>
         </w:rPr>
         <w:t>Отделение ______________________________</w:t>
       </w:r>
@@ -66,26 +60,16 @@
     <w:p>
       <w:pPr>
         <w:keepNext w:val="0"/>
-        <w:spacing w:line="360" w:lineRule="auto" w:before="0" w:after="0"/>
-        <w:ind w:firstLine="709" w:left="0" w:right="0"/>
-        <w:jc w:val="both"/>
-      </w:pPr>
-    </w:p>
-    <w:p>
-      <w:pPr>
-        <w:keepNext w:val="0"/>
-        <w:spacing w:line="360" w:lineRule="auto" w:before="600" w:after="0"/>
-        <w:ind w:firstLine="0" w:left="0" w:right="0"/>
+        <w:spacing w:before="0" w:after="240"/>
+        <w:ind w:firstLine="0"/>
         <w:jc w:val="center"/>
       </w:pPr>
       <w:r>
         <w:rPr>
-          <w:rFonts w:ascii="Times New Roman" w:hAnsi="Times New Roman" w:cs="Times New Roman" w:eastAsia="Times New Roman"/>
+          <w:rFonts w:ascii="Times New Roman" w:hAnsi="Times New Roman" w:eastAsia="Times New Roman"/>
           <w:b/>
-          <w:i w:val="0"/>
           <w:color w:val="000000"/>
           <w:sz w:val="28"/>
-          <w:lang w:val="ru-RU"/>
         </w:rPr>
         <w:t>ОТЧЁТ</w:t>
         <w:br/>
@@ -95,18 +79,16 @@
     <w:p>
       <w:pPr>
         <w:keepNext w:val="0"/>
-        <w:spacing w:line="360" w:lineRule="auto" w:before="0" w:after="0"/>
-        <w:ind w:firstLine="0" w:left="0" w:right="0"/>
+        <w:spacing w:before="0" w:after="240"/>
+        <w:ind w:firstLine="0"/>
         <w:jc w:val="center"/>
       </w:pPr>
       <w:r>
         <w:rPr>
-          <w:rFonts w:ascii="Times New Roman" w:hAnsi="Times New Roman" w:cs="Times New Roman" w:eastAsia="Times New Roman"/>
+          <w:rFonts w:ascii="Times New Roman" w:hAnsi="Times New Roman" w:eastAsia="Times New Roman"/>
           <w:b w:val="0"/>
-          <w:i w:val="0"/>
           <w:color w:val="000000"/>
           <w:sz w:val="28"/>
-          <w:lang w:val="ru-RU"/>
         </w:rPr>
         <w:t>по дисциплине «Метрология, стандартизация</w:t>
         <w:br/>
@@ -116,37 +98,33 @@
     <w:p>
       <w:pPr>
         <w:keepNext w:val="0"/>
-        <w:spacing w:line="360" w:lineRule="auto" w:before="280" w:after="0"/>
-        <w:ind w:firstLine="0" w:left="0" w:right="0"/>
+        <w:spacing w:before="0" w:after="480"/>
+        <w:ind w:firstLine="0"/>
         <w:jc w:val="center"/>
       </w:pPr>
       <w:r>
         <w:rPr>
-          <w:rFonts w:ascii="Times New Roman" w:hAnsi="Times New Roman" w:cs="Times New Roman" w:eastAsia="Times New Roman"/>
+          <w:rFonts w:ascii="Times New Roman" w:hAnsi="Times New Roman" w:eastAsia="Times New Roman"/>
           <w:b w:val="0"/>
-          <w:i w:val="0"/>
           <w:color w:val="000000"/>
           <w:sz w:val="28"/>
-          <w:lang w:val="ru-RU"/>
         </w:rPr>
-        <w:t>Тема: «Сравнительный анализ требований российских (ГОСТ Р, ФСТЭК) и международных (ISO/IEC) стандартов в области защиты информации»</w:t>
+        <w:t>Тема: «Анализ иерархии и структуры нормативно-правового регулирования в области защиты информации»</w:t>
       </w:r>
     </w:p>
     <w:p>
       <w:pPr>
         <w:keepNext w:val="0"/>
-        <w:spacing w:line="360" w:lineRule="auto" w:before="600" w:after="0"/>
-        <w:ind w:firstLine="0" w:left="0" w:right="0"/>
+        <w:spacing w:before="0" w:after="0"/>
+        <w:ind w:firstLine="0"/>
         <w:jc w:val="center"/>
       </w:pPr>
       <w:r>
         <w:rPr>
-          <w:rFonts w:ascii="Times New Roman" w:hAnsi="Times New Roman" w:cs="Times New Roman" w:eastAsia="Times New Roman"/>
+          <w:rFonts w:ascii="Times New Roman" w:hAnsi="Times New Roman" w:eastAsia="Times New Roman"/>
           <w:b w:val="0"/>
-          <w:i w:val="0"/>
           <w:color w:val="000000"/>
           <w:sz w:val="28"/>
-          <w:lang w:val="ru-RU"/>
         </w:rPr>
         <w:t>Выполнил(а): __________________________</w:t>
         <w:br/>
@@ -158,317 +136,93 @@
     <w:p>
       <w:pPr>
         <w:keepNext w:val="0"/>
-        <w:spacing w:line="360" w:lineRule="auto" w:before="800" w:after="0"/>
-        <w:ind w:firstLine="0" w:left="0" w:right="0"/>
+        <w:spacing w:before="480" w:after="0"/>
+        <w:ind w:firstLine="0"/>
         <w:jc w:val="center"/>
       </w:pPr>
       <w:r>
         <w:rPr>
-          <w:rFonts w:ascii="Times New Roman" w:hAnsi="Times New Roman" w:cs="Times New Roman" w:eastAsia="Times New Roman"/>
+          <w:rFonts w:ascii="Times New Roman" w:hAnsi="Times New Roman" w:eastAsia="Times New Roman"/>
           <w:b w:val="0"/>
-          <w:i w:val="0"/>
           <w:color w:val="000000"/>
           <w:sz w:val="28"/>
-          <w:lang w:val="ru-RU"/>
         </w:rPr>
         <w:t>Уфа 2026</w:t>
       </w:r>
     </w:p>
     <w:p>
+      <w:pPr>
+        <w:keepNext/>
+        <w:pageBreakBefore/>
+        <w:spacing w:before="0" w:after="0"/>
+      </w:pPr>
       <w:r>
-        <w:br w:type="page"/>
+        <w:rPr>
+          <w:rFonts w:ascii="Times New Roman" w:hAnsi="Times New Roman" w:eastAsia="Times New Roman"/>
+          <w:b/>
+          <w:color w:val="000000"/>
+          <w:sz w:val="28"/>
+        </w:rPr>
+        <w:t>1 Цель и ход работы</w:t>
+      </w:r>
+    </w:p>
+    <w:p>
+      <w:pPr>
+        <w:keepNext w:val="0"/>
+        <w:spacing w:before="0" w:after="0"/>
+      </w:pPr>
+      <w:r>
+        <w:rPr>
+          <w:rFonts w:ascii="Times New Roman" w:hAnsi="Times New Roman" w:eastAsia="Times New Roman"/>
+          <w:b w:val="0"/>
+          <w:color w:val="000000"/>
+          <w:sz w:val="28"/>
+        </w:rPr>
+        <w:t>Цель — классифицировать документы ИБ и проанализировать статьи 149-ФЗ. Ход: изучены лекции и методичка, сопоставлены уровни актов, выделены права и обязанности [1–3].</w:t>
+      </w:r>
+    </w:p>
+    <w:p>
+      <w:pPr>
+        <w:keepNext w:val="0"/>
+        <w:spacing w:before="0" w:after="0"/>
+      </w:pPr>
+      <w:r>
+        <w:rPr>
+          <w:rFonts w:ascii="Times New Roman" w:hAnsi="Times New Roman" w:eastAsia="Times New Roman"/>
+          <w:b w:val="0"/>
+          <w:color w:val="000000"/>
+          <w:sz w:val="28"/>
+        </w:rPr>
+        <w:t>Задание 1. Конституция РФ одна: вместо вымышленных двух конституций приведены две группы её норм. У каждого другого уровня — два документа. Стандарты выделены условно, они не являются нормативными правовыми актами.</w:t>
       </w:r>
     </w:p>
     <w:p>
       <w:pPr>
         <w:keepNext/>
-        <w:spacing w:line="360" w:lineRule="auto" w:before="0" w:after="0"/>
-        <w:ind w:firstLine="709" w:left="0" w:right="0"/>
-        <w:jc w:val="both"/>
+        <w:spacing w:before="0" w:after="0"/>
       </w:pPr>
       <w:r>
         <w:rPr>
-          <w:rFonts w:ascii="Times New Roman" w:hAnsi="Times New Roman" w:cs="Times New Roman" w:eastAsia="Times New Roman"/>
-          <w:b/>
-          <w:i w:val="0"/>
+          <w:rFonts w:ascii="Times New Roman" w:hAnsi="Times New Roman" w:eastAsia="Times New Roman"/>
+          <w:b w:val="0"/>
           <w:color w:val="000000"/>
           <w:sz w:val="28"/>
-          <w:lang w:val="ru-RU"/>
         </w:rPr>
-        <w:t>1 Цель и задачи работы</w:t>
-      </w:r>
-    </w:p>
-    <w:p>
-      <w:pPr>
-        <w:keepNext w:val="0"/>
-        <w:spacing w:line="360" w:lineRule="auto" w:before="0" w:after="0"/>
-        <w:ind w:firstLine="709" w:left="0" w:right="0"/>
-        <w:jc w:val="both"/>
-      </w:pPr>
-      <w:r>
-        <w:rPr>
-          <w:rFonts w:ascii="Times New Roman" w:hAnsi="Times New Roman" w:cs="Times New Roman" w:eastAsia="Times New Roman"/>
-          <w:b w:val="0"/>
-          <w:i w:val="0"/>
-          <w:color w:val="000000"/>
-          <w:sz w:val="28"/>
-          <w:lang w:val="ru-RU"/>
-        </w:rPr>
-        <w:t>Цель — сопоставить требования стандартов и регулятора в области защиты информации. Задачи: изучить нормативную базу, заполнить таблицу, определить области применения и оформить результаты [1, 2].</w:t>
-      </w:r>
-    </w:p>
-    <w:p>
-      <w:pPr>
-        <w:keepNext/>
-        <w:spacing w:line="360" w:lineRule="auto" w:before="0" w:after="0"/>
-        <w:ind w:firstLine="709" w:left="0" w:right="0"/>
-        <w:jc w:val="both"/>
-      </w:pPr>
-      <w:r>
-        <w:rPr>
-          <w:rFonts w:ascii="Times New Roman" w:hAnsi="Times New Roman" w:cs="Times New Roman" w:eastAsia="Times New Roman"/>
-          <w:b/>
-          <w:i w:val="0"/>
-          <w:color w:val="000000"/>
-          <w:sz w:val="28"/>
-          <w:lang w:val="ru-RU"/>
-        </w:rPr>
-        <w:t>2 Ход работы</w:t>
-      </w:r>
-    </w:p>
-    <w:p>
-      <w:pPr>
-        <w:keepNext w:val="0"/>
-        <w:spacing w:line="360" w:lineRule="auto" w:before="0" w:after="0"/>
-        <w:ind w:firstLine="709" w:left="0" w:right="0"/>
-        <w:jc w:val="both"/>
-      </w:pPr>
-      <w:r>
-        <w:rPr>
-          <w:rFonts w:ascii="Times New Roman" w:hAnsi="Times New Roman" w:cs="Times New Roman" w:eastAsia="Times New Roman"/>
-          <w:b w:val="0"/>
-          <w:i w:val="0"/>
-          <w:color w:val="000000"/>
-          <w:sz w:val="28"/>
-          <w:lang w:val="ru-RU"/>
-        </w:rPr>
-        <w:t>Анализ лекций: стандартизация согласует требования и терминологию; ГОСТ Р — национальный, ГОСТ — межгосударственный стандарт. ISO 9001 задаёт требования к менеджменту качества, ISO 9004 — рекомендации по устойчивому успеху. Процессный подход и цикл PDCA связывают планирование, выполнение, проверку и улучшение. В ИБ управление рисками дополняет обязательные меры защиты [1].</w:t>
-      </w:r>
-    </w:p>
-    <w:p>
-      <w:pPr>
-        <w:keepNext w:val="0"/>
-        <w:spacing w:line="360" w:lineRule="auto" w:before="0" w:after="0"/>
-        <w:ind w:firstLine="709" w:left="0" w:right="0"/>
-        <w:jc w:val="both"/>
-      </w:pPr>
-      <w:r>
-        <w:rPr>
-          <w:rFonts w:ascii="Times New Roman" w:hAnsi="Times New Roman" w:cs="Times New Roman" w:eastAsia="Times New Roman"/>
-          <w:b w:val="0"/>
-          <w:i w:val="0"/>
-          <w:color w:val="000000"/>
-          <w:sz w:val="28"/>
-          <w:lang w:val="ru-RU"/>
-        </w:rPr>
-        <w:t>Уточнение методички: дата приказа № 17 — 11.02.2013, а не 11.02.2021; ГОСТ Р ИСО/МЭК 27001-2021 идентичен ISO/IEC 27001:2013, не редакции 2022 года. С 01.03.2026 приказ № 17 заменён приказом № 117. Ниже № 17 рассмотрен ретроспективно по заданию [4, 5, 9].</w:t>
-      </w:r>
-    </w:p>
-    <w:p>
-      <w:pPr>
-        <w:keepNext w:val="0"/>
-        <w:spacing w:line="360" w:lineRule="auto" w:before="0" w:after="0"/>
-        <w:ind w:firstLine="709" w:left="0" w:right="0"/>
-        <w:jc w:val="both"/>
-      </w:pPr>
-      <w:r>
-        <w:rPr>
-          <w:rFonts w:ascii="Times New Roman" w:hAnsi="Times New Roman" w:cs="Times New Roman" w:eastAsia="Times New Roman"/>
-          <w:b/>
-          <w:i w:val="0"/>
-          <w:color w:val="000000"/>
-          <w:sz w:val="28"/>
-          <w:lang w:val="ru-RU"/>
-        </w:rPr>
-        <w:t>Задание 1. Пять нормативных документов:</w:t>
-      </w:r>
-    </w:p>
-    <w:p>
-      <w:pPr>
-        <w:keepNext w:val="0"/>
-        <w:spacing w:line="360" w:lineRule="auto" w:before="0" w:after="0"/>
-        <w:ind w:firstLine="709" w:left="0" w:right="0"/>
-        <w:jc w:val="both"/>
-      </w:pPr>
-      <w:r>
-        <w:rPr>
-          <w:rFonts w:ascii="Times New Roman" w:hAnsi="Times New Roman" w:cs="Times New Roman" w:eastAsia="Times New Roman"/>
-          <w:b w:val="0"/>
-          <w:i w:val="0"/>
-          <w:color w:val="000000"/>
-          <w:sz w:val="28"/>
-          <w:lang w:val="ru-RU"/>
-        </w:rPr>
-        <w:t>1) Закон: Федеральный закон от 27.07.2006 № 149-ФЗ «Об информации, информационных технологиях и о защите информации» — правовые основы обращения и защиты информации [3].</w:t>
-      </w:r>
-    </w:p>
-    <w:p>
-      <w:pPr>
-        <w:keepNext w:val="0"/>
-        <w:spacing w:line="360" w:lineRule="auto" w:before="0" w:after="0"/>
-        <w:ind w:firstLine="709" w:left="0" w:right="0"/>
-        <w:jc w:val="both"/>
-      </w:pPr>
-      <w:r>
-        <w:rPr>
-          <w:rFonts w:ascii="Times New Roman" w:hAnsi="Times New Roman" w:cs="Times New Roman" w:eastAsia="Times New Roman"/>
-          <w:b w:val="0"/>
-          <w:i w:val="0"/>
-          <w:color w:val="000000"/>
-          <w:sz w:val="28"/>
-          <w:lang w:val="ru-RU"/>
-        </w:rPr>
-        <w:t>2) Подзаконный акт: приказ ФСТЭК России от 11.02.2013 № 17 «Об утверждении Требований о защите информации, не составляющей государственную тайну, содержащейся в государственных информационных системах» — защита ГИС в период действия [4].</w:t>
-      </w:r>
-    </w:p>
-    <w:p>
-      <w:pPr>
-        <w:keepNext w:val="0"/>
-        <w:spacing w:line="360" w:lineRule="auto" w:before="0" w:after="0"/>
-        <w:ind w:firstLine="709" w:left="0" w:right="0"/>
-        <w:jc w:val="both"/>
-      </w:pPr>
-      <w:r>
-        <w:rPr>
-          <w:rFonts w:ascii="Times New Roman" w:hAnsi="Times New Roman" w:cs="Times New Roman" w:eastAsia="Times New Roman"/>
-          <w:b w:val="0"/>
-          <w:i w:val="0"/>
-          <w:color w:val="000000"/>
-          <w:sz w:val="28"/>
-          <w:lang w:val="ru-RU"/>
-        </w:rPr>
-        <w:t>3) Национальный стандарт: ГОСТ Р ИСО/МЭК 27001-2021 «Информационная технология. Методы и средства обеспечения безопасности. Системы менеджмента информационной безопасности. Требования» — СМИБ организаций любого типа [5].</w:t>
-      </w:r>
-    </w:p>
-    <w:p>
-      <w:pPr>
-        <w:keepNext w:val="0"/>
-        <w:spacing w:line="360" w:lineRule="auto" w:before="0" w:after="0"/>
-        <w:ind w:firstLine="709" w:left="0" w:right="0"/>
-        <w:jc w:val="both"/>
-      </w:pPr>
-      <w:r>
-        <w:rPr>
-          <w:rFonts w:ascii="Times New Roman" w:hAnsi="Times New Roman" w:cs="Times New Roman" w:eastAsia="Times New Roman"/>
-          <w:b w:val="0"/>
-          <w:i w:val="0"/>
-          <w:color w:val="000000"/>
-          <w:sz w:val="28"/>
-          <w:lang w:val="ru-RU"/>
-        </w:rPr>
-        <w:t>4) Национальный стандарт: ГОСТ Р 50922-2006 «Защита информации. Основные термины и определения» — единая терминология защиты информации [6].</w:t>
-      </w:r>
-    </w:p>
-    <w:p>
-      <w:pPr>
-        <w:keepNext w:val="0"/>
-        <w:spacing w:line="360" w:lineRule="auto" w:before="0" w:after="0"/>
-        <w:ind w:firstLine="709" w:left="0" w:right="0"/>
-        <w:jc w:val="both"/>
-      </w:pPr>
-      <w:r>
-        <w:rPr>
-          <w:rFonts w:ascii="Times New Roman" w:hAnsi="Times New Roman" w:cs="Times New Roman" w:eastAsia="Times New Roman"/>
-          <w:b w:val="0"/>
-          <w:i w:val="0"/>
-          <w:color w:val="000000"/>
-          <w:sz w:val="28"/>
-          <w:lang w:val="ru-RU"/>
-        </w:rPr>
-        <w:t>5) Международный стандарт: ISO/IEC 27001:2013 «Information technology — Security techniques — Information security management systems — Requirements» — требования к СМИБ; международная основа стандарта из п. 3 [7].</w:t>
-      </w:r>
-    </w:p>
-    <w:p>
-      <w:r>
-        <w:br w:type="page"/>
-      </w:r>
-    </w:p>
-    <w:p>
-      <w:pPr>
-        <w:keepNext/>
-        <w:spacing w:line="360" w:lineRule="auto" w:before="0" w:after="0"/>
-        <w:ind w:firstLine="709" w:left="0" w:right="0"/>
-        <w:jc w:val="both"/>
-      </w:pPr>
-      <w:r>
-        <w:rPr>
-          <w:rFonts w:ascii="Times New Roman" w:hAnsi="Times New Roman" w:cs="Times New Roman" w:eastAsia="Times New Roman"/>
-          <w:b/>
-          <w:i w:val="0"/>
-          <w:color w:val="000000"/>
-          <w:sz w:val="28"/>
-          <w:lang w:val="ru-RU"/>
-        </w:rPr>
-        <w:t>3 Результаты работы</w:t>
-      </w:r>
-    </w:p>
-    <w:p>
-      <w:pPr>
-        <w:keepNext w:val="0"/>
-        <w:spacing w:line="360" w:lineRule="auto" w:before="0" w:after="0"/>
-        <w:ind w:firstLine="709" w:left="0" w:right="0"/>
-        <w:jc w:val="both"/>
-      </w:pPr>
-      <w:r>
-        <w:rPr>
-          <w:rFonts w:ascii="Times New Roman" w:hAnsi="Times New Roman" w:cs="Times New Roman" w:eastAsia="Times New Roman"/>
-          <w:b w:val="0"/>
-          <w:i w:val="0"/>
-          <w:color w:val="000000"/>
-          <w:sz w:val="28"/>
-          <w:lang w:val="ru-RU"/>
-        </w:rPr>
-        <w:t>Задание 2. Сопоставлены требования к системе менеджмента и к защите конкретной ГИС. Ссылки: стандарт — [5], приказ — [4].</w:t>
-      </w:r>
-    </w:p>
-    <w:p>
-      <w:pPr>
-        <w:keepNext/>
-        <w:spacing w:line="360" w:lineRule="auto" w:before="0" w:after="0"/>
-        <w:ind w:firstLine="0" w:left="0" w:right="0"/>
-        <w:jc w:val="both"/>
-      </w:pPr>
-      <w:r>
-        <w:rPr>
-          <w:rFonts w:ascii="Times New Roman" w:hAnsi="Times New Roman" w:cs="Times New Roman" w:eastAsia="Times New Roman"/>
-          <w:b w:val="0"/>
-          <w:i w:val="0"/>
-          <w:color w:val="000000"/>
-          <w:sz w:val="28"/>
-          <w:lang w:val="ru-RU"/>
-        </w:rPr>
-        <w:t>Таблица 1 — Сравнительный анализ требований</w:t>
+        <w:t>Таблица 1 — Иерархия документов (начало)</w:t>
       </w:r>
     </w:p>
     <w:tbl>
       <w:tblPr>
+        <w:tblStyle w:val="TableGrid"/>
         <w:tblW w:type="auto" w:w="0"/>
         <w:jc w:val="center"/>
         <w:tblLayout w:type="fixed"/>
         <w:tblLook w:firstColumn="1" w:firstRow="1" w:lastColumn="0" w:lastRow="0" w:noHBand="0" w:noVBand="1" w:val="04A0"/>
-        <w:tblBorders>
-          <w:top w:val="single" w:sz="4" w:space="0" w:color="000000"/>
-          <w:left w:val="single" w:sz="4" w:space="0" w:color="000000"/>
-          <w:bottom w:val="single" w:sz="4" w:space="0" w:color="000000"/>
-          <w:right w:val="single" w:sz="4" w:space="0" w:color="000000"/>
-          <w:insideH w:val="single" w:sz="4" w:space="0" w:color="000000"/>
-          <w:insideV w:val="single" w:sz="4" w:space="0" w:color="000000"/>
-        </w:tblBorders>
       </w:tblPr>
       <w:tblGrid>
+        <w:gridCol w:w="1417"/>
+        <w:gridCol w:w="6066"/>
         <w:gridCol w:w="1871"/>
-        <w:gridCol w:w="3742"/>
-        <w:gridCol w:w="3742"/>
       </w:tblGrid>
       <w:tr>
         <w:trPr>
@@ -477,73 +231,64 @@
         </w:trPr>
         <w:tc>
           <w:tcPr>
+            <w:tcW w:type="dxa" w:w="1417"/>
+            <w:vAlign w:val="top"/>
+          </w:tcPr>
+          <w:p>
+            <w:pPr>
+              <w:spacing w:line="360" w:lineRule="auto" w:before="0" w:after="0"/>
+              <w:ind w:firstLine="0"/>
+              <w:jc w:val="left"/>
+            </w:pPr>
+            <w:r>
+              <w:rPr>
+                <w:rFonts w:ascii="Times New Roman" w:hAnsi="Times New Roman"/>
+                <w:b/>
+                <w:sz w:val="24"/>
+              </w:rPr>
+              <w:t>Уровень</w:t>
+            </w:r>
+          </w:p>
+        </w:tc>
+        <w:tc>
+          <w:tcPr>
+            <w:tcW w:type="dxa" w:w="6066"/>
+            <w:vAlign w:val="top"/>
+          </w:tcPr>
+          <w:p>
+            <w:pPr>
+              <w:spacing w:line="360" w:lineRule="auto" w:before="0" w:after="0"/>
+              <w:ind w:firstLine="0"/>
+              <w:jc w:val="left"/>
+            </w:pPr>
+            <w:r>
+              <w:rPr>
+                <w:rFonts w:ascii="Times New Roman" w:hAnsi="Times New Roman"/>
+                <w:b/>
+                <w:sz w:val="24"/>
+              </w:rPr>
+              <w:t>Документ, дата</w:t>
+            </w:r>
+          </w:p>
+        </w:tc>
+        <w:tc>
+          <w:tcPr>
             <w:tcW w:type="dxa" w:w="1871"/>
             <w:vAlign w:val="top"/>
           </w:tcPr>
           <w:p>
             <w:pPr>
-              <w:spacing w:line="360" w:lineRule="auto" w:after="0"/>
+              <w:spacing w:line="360" w:lineRule="auto" w:before="0" w:after="0"/>
               <w:ind w:firstLine="0"/>
               <w:jc w:val="left"/>
             </w:pPr>
             <w:r>
               <w:rPr>
-                <w:rFonts w:ascii="Times New Roman" w:hAnsi="Times New Roman" w:cs="Times New Roman" w:eastAsia="Times New Roman"/>
+                <w:rFonts w:ascii="Times New Roman" w:hAnsi="Times New Roman"/>
                 <w:b/>
-                <w:i w:val="0"/>
-                <w:color w:val="000000"/>
                 <w:sz w:val="24"/>
-                <w:lang w:val="ru-RU"/>
               </w:rPr>
-              <w:t>Критерий</w:t>
-            </w:r>
-          </w:p>
-        </w:tc>
-        <w:tc>
-          <w:tcPr>
-            <w:tcW w:type="dxa" w:w="3742"/>
-            <w:vAlign w:val="top"/>
-          </w:tcPr>
-          <w:p>
-            <w:pPr>
-              <w:spacing w:line="360" w:lineRule="auto" w:after="0"/>
-              <w:ind w:firstLine="0"/>
-              <w:jc w:val="left"/>
-            </w:pPr>
-            <w:r>
-              <w:rPr>
-                <w:rFonts w:ascii="Times New Roman" w:hAnsi="Times New Roman" w:cs="Times New Roman" w:eastAsia="Times New Roman"/>
-                <w:b/>
-                <w:i w:val="0"/>
-                <w:color w:val="000000"/>
-                <w:sz w:val="24"/>
-                <w:lang w:val="ru-RU"/>
-              </w:rPr>
-              <w:t>ГОСТ Р ИСО/МЭК 27001-2021</w:t>
-            </w:r>
-          </w:p>
-        </w:tc>
-        <w:tc>
-          <w:tcPr>
-            <w:tcW w:type="dxa" w:w="3742"/>
-            <w:vAlign w:val="top"/>
-          </w:tcPr>
-          <w:p>
-            <w:pPr>
-              <w:spacing w:line="360" w:lineRule="auto" w:after="0"/>
-              <w:ind w:firstLine="0"/>
-              <w:jc w:val="left"/>
-            </w:pPr>
-            <w:r>
-              <w:rPr>
-                <w:rFonts w:ascii="Times New Roman" w:hAnsi="Times New Roman" w:cs="Times New Roman" w:eastAsia="Times New Roman"/>
-                <w:b/>
-                <w:i w:val="0"/>
-                <w:color w:val="000000"/>
-                <w:sz w:val="24"/>
-                <w:lang w:val="ru-RU"/>
-              </w:rPr>
-              <w:t>Приказ ФСТЭК России от 11.02.2013 № 17</w:t>
+              <w:t>Предмет регулирования</w:t>
             </w:r>
           </w:p>
         </w:tc>
@@ -554,73 +299,64 @@
         </w:trPr>
         <w:tc>
           <w:tcPr>
+            <w:tcW w:type="dxa" w:w="1417"/>
+            <w:vAlign w:val="top"/>
+          </w:tcPr>
+          <w:p>
+            <w:pPr>
+              <w:spacing w:line="360" w:lineRule="auto" w:before="0" w:after="0"/>
+              <w:ind w:firstLine="0"/>
+              <w:jc w:val="left"/>
+            </w:pPr>
+            <w:r>
+              <w:rPr>
+                <w:rFonts w:ascii="Times New Roman" w:hAnsi="Times New Roman"/>
+                <w:b w:val="0"/>
+                <w:sz w:val="24"/>
+              </w:rPr>
+              <w:t>1. Конституция</w:t>
+            </w:r>
+          </w:p>
+        </w:tc>
+        <w:tc>
+          <w:tcPr>
+            <w:tcW w:type="dxa" w:w="6066"/>
+            <w:vAlign w:val="top"/>
+          </w:tcPr>
+          <w:p>
+            <w:pPr>
+              <w:spacing w:line="360" w:lineRule="auto" w:before="0" w:after="0"/>
+              <w:ind w:firstLine="0"/>
+              <w:jc w:val="left"/>
+            </w:pPr>
+            <w:r>
+              <w:rPr>
+                <w:rFonts w:ascii="Times New Roman" w:hAnsi="Times New Roman"/>
+                <w:b w:val="0"/>
+                <w:sz w:val="24"/>
+              </w:rPr>
+              <w:t>Конституция Российской Федерации, принята 12.12.1993: ст. 23–24 [2].</w:t>
+            </w:r>
+          </w:p>
+        </w:tc>
+        <w:tc>
+          <w:tcPr>
             <w:tcW w:type="dxa" w:w="1871"/>
             <w:vAlign w:val="top"/>
           </w:tcPr>
           <w:p>
             <w:pPr>
-              <w:spacing w:line="360" w:lineRule="auto" w:after="0"/>
+              <w:spacing w:line="360" w:lineRule="auto" w:before="0" w:after="0"/>
               <w:ind w:firstLine="0"/>
               <w:jc w:val="left"/>
             </w:pPr>
             <w:r>
               <w:rPr>
-                <w:rFonts w:ascii="Times New Roman" w:hAnsi="Times New Roman" w:cs="Times New Roman" w:eastAsia="Times New Roman"/>
+                <w:rFonts w:ascii="Times New Roman" w:hAnsi="Times New Roman"/>
                 <w:b w:val="0"/>
-                <w:i w:val="0"/>
-                <w:color w:val="000000"/>
                 <w:sz w:val="24"/>
-                <w:lang w:val="ru-RU"/>
               </w:rPr>
-              <w:t>Назначение документа</w:t>
-            </w:r>
-          </w:p>
-        </w:tc>
-        <w:tc>
-          <w:tcPr>
-            <w:tcW w:type="dxa" w:w="3742"/>
-            <w:vAlign w:val="top"/>
-          </w:tcPr>
-          <w:p>
-            <w:pPr>
-              <w:spacing w:line="360" w:lineRule="auto" w:after="0"/>
-              <w:ind w:firstLine="0"/>
-              <w:jc w:val="left"/>
-            </w:pPr>
-            <w:r>
-              <w:rPr>
-                <w:rFonts w:ascii="Times New Roman" w:hAnsi="Times New Roman" w:cs="Times New Roman" w:eastAsia="Times New Roman"/>
-                <w:b w:val="0"/>
-                <w:i w:val="0"/>
-                <w:color w:val="000000"/>
-                <w:sz w:val="24"/>
-                <w:lang w:val="ru-RU"/>
-              </w:rPr>
-              <w:t>Создание, внедрение, поддержка и постоянное улучшение СМИБ; сохранение конфиденциальности, целостности и доступности информации.</w:t>
-            </w:r>
-          </w:p>
-        </w:tc>
-        <w:tc>
-          <w:tcPr>
-            <w:tcW w:type="dxa" w:w="3742"/>
-            <w:vAlign w:val="top"/>
-          </w:tcPr>
-          <w:p>
-            <w:pPr>
-              <w:spacing w:line="360" w:lineRule="auto" w:after="0"/>
-              <w:ind w:firstLine="0"/>
-              <w:jc w:val="left"/>
-            </w:pPr>
-            <w:r>
-              <w:rPr>
-                <w:rFonts w:ascii="Times New Roman" w:hAnsi="Times New Roman" w:cs="Times New Roman" w:eastAsia="Times New Roman"/>
-                <w:b w:val="0"/>
-                <w:i w:val="0"/>
-                <w:color w:val="000000"/>
-                <w:sz w:val="24"/>
-                <w:lang w:val="ru-RU"/>
-              </w:rPr>
-              <w:t>Установление организационных и технических требований к защите информации, не составляющей государственную тайну, в ГИС.</w:t>
+              <w:t>Приватность; тайна связи.</w:t>
             </w:r>
           </w:p>
         </w:tc>
@@ -631,73 +367,64 @@
         </w:trPr>
         <w:tc>
           <w:tcPr>
+            <w:tcW w:type="dxa" w:w="1417"/>
+            <w:vAlign w:val="top"/>
+          </w:tcPr>
+          <w:p>
+            <w:pPr>
+              <w:spacing w:line="360" w:lineRule="auto" w:before="0" w:after="0"/>
+              <w:ind w:firstLine="0"/>
+              <w:jc w:val="left"/>
+            </w:pPr>
+            <w:r>
+              <w:rPr>
+                <w:rFonts w:ascii="Times New Roman" w:hAnsi="Times New Roman"/>
+                <w:b w:val="0"/>
+                <w:sz w:val="24"/>
+              </w:rPr>
+              <w:t>1. Конституция</w:t>
+            </w:r>
+          </w:p>
+        </w:tc>
+        <w:tc>
+          <w:tcPr>
+            <w:tcW w:type="dxa" w:w="6066"/>
+            <w:vAlign w:val="top"/>
+          </w:tcPr>
+          <w:p>
+            <w:pPr>
+              <w:spacing w:line="360" w:lineRule="auto" w:before="0" w:after="0"/>
+              <w:ind w:firstLine="0"/>
+              <w:jc w:val="left"/>
+            </w:pPr>
+            <w:r>
+              <w:rPr>
+                <w:rFonts w:ascii="Times New Roman" w:hAnsi="Times New Roman"/>
+                <w:b w:val="0"/>
+                <w:sz w:val="24"/>
+              </w:rPr>
+              <w:t>Тот же документ: ст. 29, ч. 4 [2].</w:t>
+            </w:r>
+          </w:p>
+        </w:tc>
+        <w:tc>
+          <w:tcPr>
             <w:tcW w:type="dxa" w:w="1871"/>
             <w:vAlign w:val="top"/>
           </w:tcPr>
           <w:p>
             <w:pPr>
-              <w:spacing w:line="360" w:lineRule="auto" w:after="0"/>
+              <w:spacing w:line="360" w:lineRule="auto" w:before="0" w:after="0"/>
               <w:ind w:firstLine="0"/>
               <w:jc w:val="left"/>
             </w:pPr>
             <w:r>
               <w:rPr>
-                <w:rFonts w:ascii="Times New Roman" w:hAnsi="Times New Roman" w:cs="Times New Roman" w:eastAsia="Times New Roman"/>
+                <w:rFonts w:ascii="Times New Roman" w:hAnsi="Times New Roman"/>
                 <w:b w:val="0"/>
-                <w:i w:val="0"/>
-                <w:color w:val="000000"/>
                 <w:sz w:val="24"/>
-                <w:lang w:val="ru-RU"/>
               </w:rPr>
-              <w:t>Объект регулирования</w:t>
-            </w:r>
-          </w:p>
-        </w:tc>
-        <w:tc>
-          <w:tcPr>
-            <w:tcW w:type="dxa" w:w="3742"/>
-            <w:vAlign w:val="top"/>
-          </w:tcPr>
-          <w:p>
-            <w:pPr>
-              <w:spacing w:line="360" w:lineRule="auto" w:after="0"/>
-              <w:ind w:firstLine="0"/>
-              <w:jc w:val="left"/>
-            </w:pPr>
-            <w:r>
-              <w:rPr>
-                <w:rFonts w:ascii="Times New Roman" w:hAnsi="Times New Roman" w:cs="Times New Roman" w:eastAsia="Times New Roman"/>
-                <w:b w:val="0"/>
-                <w:i w:val="0"/>
-                <w:color w:val="000000"/>
-                <w:sz w:val="24"/>
-                <w:lang w:val="ru-RU"/>
-              </w:rPr>
-              <w:t>СМИБ в установленной организацией области: процессы, люди, активы и технологии. Применим независимо от размера и формы собственности.</w:t>
-            </w:r>
-          </w:p>
-        </w:tc>
-        <w:tc>
-          <w:tcPr>
-            <w:tcW w:type="dxa" w:w="3742"/>
-            <w:vAlign w:val="top"/>
-          </w:tcPr>
-          <w:p>
-            <w:pPr>
-              <w:spacing w:line="360" w:lineRule="auto" w:after="0"/>
-              <w:ind w:firstLine="0"/>
-              <w:jc w:val="left"/>
-            </w:pPr>
-            <w:r>
-              <w:rPr>
-                <w:rFonts w:ascii="Times New Roman" w:hAnsi="Times New Roman" w:cs="Times New Roman" w:eastAsia="Times New Roman"/>
-                <w:b w:val="0"/>
-                <w:i w:val="0"/>
-                <w:color w:val="000000"/>
-                <w:sz w:val="24"/>
-                <w:lang w:val="ru-RU"/>
-              </w:rPr>
-              <w:t>Информация и система её защиты в ГИС. Меры определяются с учётом класса защищённости, назначения и особенностей системы.</w:t>
+              <w:t>Информационные права.</w:t>
             </w:r>
           </w:p>
         </w:tc>
@@ -708,73 +435,64 @@
         </w:trPr>
         <w:tc>
           <w:tcPr>
+            <w:tcW w:type="dxa" w:w="1417"/>
+            <w:vAlign w:val="top"/>
+          </w:tcPr>
+          <w:p>
+            <w:pPr>
+              <w:spacing w:line="360" w:lineRule="auto" w:before="0" w:after="0"/>
+              <w:ind w:firstLine="0"/>
+              <w:jc w:val="left"/>
+            </w:pPr>
+            <w:r>
+              <w:rPr>
+                <w:rFonts w:ascii="Times New Roman" w:hAnsi="Times New Roman"/>
+                <w:b w:val="0"/>
+                <w:sz w:val="24"/>
+              </w:rPr>
+              <w:t>2. Закон</w:t>
+            </w:r>
+          </w:p>
+        </w:tc>
+        <w:tc>
+          <w:tcPr>
+            <w:tcW w:type="dxa" w:w="6066"/>
+            <w:vAlign w:val="top"/>
+          </w:tcPr>
+          <w:p>
+            <w:pPr>
+              <w:spacing w:line="360" w:lineRule="auto" w:before="0" w:after="0"/>
+              <w:ind w:firstLine="0"/>
+              <w:jc w:val="left"/>
+            </w:pPr>
+            <w:r>
+              <w:rPr>
+                <w:rFonts w:ascii="Times New Roman" w:hAnsi="Times New Roman"/>
+                <w:b w:val="0"/>
+                <w:sz w:val="24"/>
+              </w:rPr>
+              <w:t>Федеральный закон от 27.07.2006 № 149-ФЗ «Об информации, информационных технологиях и о защите информации» [3].</w:t>
+            </w:r>
+          </w:p>
+        </w:tc>
+        <w:tc>
+          <w:tcPr>
             <w:tcW w:type="dxa" w:w="1871"/>
             <w:vAlign w:val="top"/>
           </w:tcPr>
           <w:p>
             <w:pPr>
-              <w:spacing w:line="360" w:lineRule="auto" w:after="0"/>
+              <w:spacing w:line="360" w:lineRule="auto" w:before="0" w:after="0"/>
               <w:ind w:firstLine="0"/>
               <w:jc w:val="left"/>
             </w:pPr>
             <w:r>
               <w:rPr>
-                <w:rFonts w:ascii="Times New Roman" w:hAnsi="Times New Roman" w:cs="Times New Roman" w:eastAsia="Times New Roman"/>
+                <w:rFonts w:ascii="Times New Roman" w:hAnsi="Times New Roman"/>
                 <w:b w:val="0"/>
-                <w:i w:val="0"/>
-                <w:color w:val="000000"/>
                 <w:sz w:val="24"/>
-                <w:lang w:val="ru-RU"/>
               </w:rPr>
-              <w:t>Обязательность применения</w:t>
-            </w:r>
-          </w:p>
-        </w:tc>
-        <w:tc>
-          <w:tcPr>
-            <w:tcW w:type="dxa" w:w="3742"/>
-            <w:vAlign w:val="top"/>
-          </w:tcPr>
-          <w:p>
-            <w:pPr>
-              <w:spacing w:line="360" w:lineRule="auto" w:after="0"/>
-              <w:ind w:firstLine="0"/>
-              <w:jc w:val="left"/>
-            </w:pPr>
-            <w:r>
-              <w:rPr>
-                <w:rFonts w:ascii="Times New Roman" w:hAnsi="Times New Roman" w:cs="Times New Roman" w:eastAsia="Times New Roman"/>
-                <w:b w:val="0"/>
-                <w:i w:val="0"/>
-                <w:color w:val="000000"/>
-                <w:sz w:val="24"/>
-                <w:lang w:val="ru-RU"/>
-              </w:rPr>
-              <w:t>По общему правилу добровольное применение. Обязательства могут следовать из договора или применимого правового акта. При заявлении соответствия нельзя исключать требования разделов 4–10.</w:t>
-            </w:r>
-          </w:p>
-        </w:tc>
-        <w:tc>
-          <w:tcPr>
-            <w:tcW w:type="dxa" w:w="3742"/>
-            <w:vAlign w:val="top"/>
-          </w:tcPr>
-          <w:p>
-            <w:pPr>
-              <w:spacing w:line="360" w:lineRule="auto" w:after="0"/>
-              <w:ind w:firstLine="0"/>
-              <w:jc w:val="left"/>
-            </w:pPr>
-            <w:r>
-              <w:rPr>
-                <w:rFonts w:ascii="Times New Roman" w:hAnsi="Times New Roman" w:cs="Times New Roman" w:eastAsia="Times New Roman"/>
-                <w:b w:val="0"/>
-                <w:i w:val="0"/>
-                <w:color w:val="000000"/>
-                <w:sz w:val="24"/>
-                <w:lang w:val="ru-RU"/>
-              </w:rPr>
-              <w:t>В период действия обязателен для систем в его области применения. Решение оператора не освобождало от установленных требований.</w:t>
+              <w:t>Оборот и защита информации.</w:t>
             </w:r>
           </w:p>
         </w:tc>
@@ -785,73 +503,178 @@
         </w:trPr>
         <w:tc>
           <w:tcPr>
+            <w:tcW w:type="dxa" w:w="1417"/>
+            <w:vAlign w:val="top"/>
+          </w:tcPr>
+          <w:p>
+            <w:pPr>
+              <w:spacing w:line="360" w:lineRule="auto" w:before="0" w:after="0"/>
+              <w:ind w:firstLine="0"/>
+              <w:jc w:val="left"/>
+            </w:pPr>
+            <w:r>
+              <w:rPr>
+                <w:rFonts w:ascii="Times New Roman" w:hAnsi="Times New Roman"/>
+                <w:b w:val="0"/>
+                <w:sz w:val="24"/>
+              </w:rPr>
+              <w:t>2. Закон</w:t>
+            </w:r>
+          </w:p>
+        </w:tc>
+        <w:tc>
+          <w:tcPr>
+            <w:tcW w:type="dxa" w:w="6066"/>
+            <w:vAlign w:val="top"/>
+          </w:tcPr>
+          <w:p>
+            <w:pPr>
+              <w:spacing w:line="360" w:lineRule="auto" w:before="0" w:after="0"/>
+              <w:ind w:firstLine="0"/>
+              <w:jc w:val="left"/>
+            </w:pPr>
+            <w:r>
+              <w:rPr>
+                <w:rFonts w:ascii="Times New Roman" w:hAnsi="Times New Roman"/>
+                <w:b w:val="0"/>
+                <w:sz w:val="24"/>
+              </w:rPr>
+              <w:t>Федеральный закон от 27.07.2006 № 152-ФЗ «О персональных данных» [4].</w:t>
+            </w:r>
+          </w:p>
+        </w:tc>
+        <w:tc>
+          <w:tcPr>
             <w:tcW w:type="dxa" w:w="1871"/>
             <w:vAlign w:val="top"/>
           </w:tcPr>
           <w:p>
             <w:pPr>
-              <w:spacing w:line="360" w:lineRule="auto" w:after="0"/>
+              <w:spacing w:line="360" w:lineRule="auto" w:before="0" w:after="0"/>
               <w:ind w:firstLine="0"/>
               <w:jc w:val="left"/>
             </w:pPr>
             <w:r>
               <w:rPr>
-                <w:rFonts w:ascii="Times New Roman" w:hAnsi="Times New Roman" w:cs="Times New Roman" w:eastAsia="Times New Roman"/>
+                <w:rFonts w:ascii="Times New Roman" w:hAnsi="Times New Roman"/>
                 <w:b w:val="0"/>
-                <w:i w:val="0"/>
-                <w:color w:val="000000"/>
                 <w:sz w:val="24"/>
-                <w:lang w:val="ru-RU"/>
               </w:rPr>
-              <w:t>Подход к управлению рисками</w:t>
+              <w:t>Обработка ПДн.</w:t>
+            </w:r>
+          </w:p>
+        </w:tc>
+      </w:tr>
+    </w:tbl>
+    <w:p>
+      <w:pPr>
+        <w:keepNext/>
+        <w:pageBreakBefore/>
+        <w:spacing w:before="0" w:after="0"/>
+      </w:pPr>
+      <w:r>
+        <w:rPr>
+          <w:rFonts w:ascii="Times New Roman" w:hAnsi="Times New Roman" w:eastAsia="Times New Roman"/>
+          <w:b/>
+          <w:color w:val="000000"/>
+          <w:sz w:val="28"/>
+        </w:rPr>
+        <w:t>2 Результаты классификации</w:t>
+      </w:r>
+    </w:p>
+    <w:p>
+      <w:pPr>
+        <w:keepNext/>
+        <w:spacing w:before="0" w:after="0"/>
+      </w:pPr>
+      <w:r>
+        <w:rPr>
+          <w:rFonts w:ascii="Times New Roman" w:hAnsi="Times New Roman" w:eastAsia="Times New Roman"/>
+          <w:b w:val="0"/>
+          <w:color w:val="000000"/>
+          <w:sz w:val="28"/>
+        </w:rPr>
+        <w:t>Продолжение таблицы 1</w:t>
+      </w:r>
+    </w:p>
+    <w:tbl>
+      <w:tblPr>
+        <w:tblStyle w:val="TableGrid"/>
+        <w:tblW w:type="auto" w:w="0"/>
+        <w:jc w:val="center"/>
+        <w:tblLayout w:type="fixed"/>
+        <w:tblLook w:firstColumn="1" w:firstRow="1" w:lastColumn="0" w:lastRow="0" w:noHBand="0" w:noVBand="1" w:val="04A0"/>
+      </w:tblPr>
+      <w:tblGrid>
+        <w:gridCol w:w="1417"/>
+        <w:gridCol w:w="6066"/>
+        <w:gridCol w:w="1871"/>
+      </w:tblGrid>
+      <w:tr>
+        <w:trPr>
+          <w:cantSplit/>
+          <w:tblHeader/>
+        </w:trPr>
+        <w:tc>
+          <w:tcPr>
+            <w:tcW w:type="dxa" w:w="1417"/>
+            <w:vAlign w:val="top"/>
+          </w:tcPr>
+          <w:p>
+            <w:pPr>
+              <w:spacing w:line="360" w:lineRule="auto" w:before="0" w:after="0"/>
+              <w:ind w:firstLine="0"/>
+              <w:jc w:val="left"/>
+            </w:pPr>
+            <w:r>
+              <w:rPr>
+                <w:rFonts w:ascii="Times New Roman" w:hAnsi="Times New Roman"/>
+                <w:b/>
+                <w:sz w:val="24"/>
+              </w:rPr>
+              <w:t>Уровень</w:t>
             </w:r>
           </w:p>
         </w:tc>
         <w:tc>
           <w:tcPr>
-            <w:tcW w:type="dxa" w:w="3742"/>
+            <w:tcW w:type="dxa" w:w="6066"/>
             <w:vAlign w:val="top"/>
           </w:tcPr>
           <w:p>
             <w:pPr>
-              <w:spacing w:line="360" w:lineRule="auto" w:after="0"/>
+              <w:spacing w:line="360" w:lineRule="auto" w:before="0" w:after="0"/>
               <w:ind w:firstLine="0"/>
               <w:jc w:val="left"/>
             </w:pPr>
             <w:r>
               <w:rPr>
-                <w:rFonts w:ascii="Times New Roman" w:hAnsi="Times New Roman" w:cs="Times New Roman" w:eastAsia="Times New Roman"/>
-                <w:b w:val="0"/>
-                <w:i w:val="0"/>
-                <w:color w:val="000000"/>
+                <w:rFonts w:ascii="Times New Roman" w:hAnsi="Times New Roman"/>
+                <w:b/>
                 <w:sz w:val="24"/>
-                <w:lang w:val="ru-RU"/>
               </w:rPr>
-              <w:t>Организация устанавливает критерии оценки и принятия рисков, проводит оценку и обработку, выбирает меры и обосновывает их в заявлении о применимости.</w:t>
+              <w:t>Документ, дата</w:t>
             </w:r>
           </w:p>
         </w:tc>
         <w:tc>
           <w:tcPr>
-            <w:tcW w:type="dxa" w:w="3742"/>
+            <w:tcW w:type="dxa" w:w="1871"/>
             <w:vAlign w:val="top"/>
           </w:tcPr>
           <w:p>
             <w:pPr>
-              <w:spacing w:line="360" w:lineRule="auto" w:after="0"/>
+              <w:spacing w:line="360" w:lineRule="auto" w:before="0" w:after="0"/>
               <w:ind w:firstLine="0"/>
               <w:jc w:val="left"/>
             </w:pPr>
             <w:r>
               <w:rPr>
-                <w:rFonts w:ascii="Times New Roman" w:hAnsi="Times New Roman" w:cs="Times New Roman" w:eastAsia="Times New Roman"/>
-                <w:b w:val="0"/>
-                <w:i w:val="0"/>
-                <w:color w:val="000000"/>
+                <w:rFonts w:ascii="Times New Roman" w:hAnsi="Times New Roman"/>
+                <w:b/>
                 <w:sz w:val="24"/>
-                <w:lang w:val="ru-RU"/>
               </w:rPr>
-              <w:t>Определяются угрозы и класс защищённости; выбирается базовый набор мер, адаптируется и уточняется по модели угроз. Это не произвольное принятие риска вместо выполнения требований.</w:t>
+              <w:t>Предмет регулирования</w:t>
             </w:r>
           </w:p>
         </w:tc>
@@ -862,447 +685,709 @@
         </w:trPr>
         <w:tc>
           <w:tcPr>
+            <w:tcW w:type="dxa" w:w="1417"/>
+            <w:vAlign w:val="top"/>
+          </w:tcPr>
+          <w:p>
+            <w:pPr>
+              <w:spacing w:line="360" w:lineRule="auto" w:before="0" w:after="0"/>
+              <w:ind w:firstLine="0"/>
+              <w:jc w:val="left"/>
+            </w:pPr>
+            <w:r>
+              <w:rPr>
+                <w:rFonts w:ascii="Times New Roman" w:hAnsi="Times New Roman"/>
+                <w:b w:val="0"/>
+                <w:sz w:val="24"/>
+              </w:rPr>
+              <w:t>3. Подзаконные акты</w:t>
+            </w:r>
+          </w:p>
+        </w:tc>
+        <w:tc>
+          <w:tcPr>
+            <w:tcW w:type="dxa" w:w="6066"/>
+            <w:vAlign w:val="top"/>
+          </w:tcPr>
+          <w:p>
+            <w:pPr>
+              <w:spacing w:line="360" w:lineRule="auto" w:before="0" w:after="0"/>
+              <w:ind w:firstLine="0"/>
+              <w:jc w:val="left"/>
+            </w:pPr>
+            <w:r>
+              <w:rPr>
+                <w:rFonts w:ascii="Times New Roman" w:hAnsi="Times New Roman"/>
+                <w:b w:val="0"/>
+                <w:sz w:val="24"/>
+              </w:rPr>
+              <w:t>Указ Президента РФ от 05.12.2016 № 646 «Об утверждении Доктрины информационной безопасности Российской Федерации» [5].</w:t>
+            </w:r>
+          </w:p>
+        </w:tc>
+        <w:tc>
+          <w:tcPr>
             <w:tcW w:type="dxa" w:w="1871"/>
             <w:vAlign w:val="top"/>
           </w:tcPr>
           <w:p>
             <w:pPr>
-              <w:spacing w:line="360" w:lineRule="auto" w:after="0"/>
+              <w:spacing w:line="360" w:lineRule="auto" w:before="0" w:after="0"/>
               <w:ind w:firstLine="0"/>
               <w:jc w:val="left"/>
             </w:pPr>
             <w:r>
               <w:rPr>
-                <w:rFonts w:ascii="Times New Roman" w:hAnsi="Times New Roman" w:cs="Times New Roman" w:eastAsia="Times New Roman"/>
+                <w:rFonts w:ascii="Times New Roman" w:hAnsi="Times New Roman"/>
                 <w:b w:val="0"/>
-                <w:i w:val="0"/>
-                <w:color w:val="000000"/>
                 <w:sz w:val="24"/>
-                <w:lang w:val="ru-RU"/>
               </w:rPr>
-              <w:t>Аттестация / сертификация</w:t>
+              <w:t>Стратегия ИБ.</w:t>
+            </w:r>
+          </w:p>
+        </w:tc>
+      </w:tr>
+      <w:tr>
+        <w:trPr>
+          <w:cantSplit/>
+        </w:trPr>
+        <w:tc>
+          <w:tcPr>
+            <w:tcW w:type="dxa" w:w="1417"/>
+            <w:vAlign w:val="top"/>
+          </w:tcPr>
+          <w:p>
+            <w:pPr>
+              <w:spacing w:line="360" w:lineRule="auto" w:before="0" w:after="0"/>
+              <w:ind w:firstLine="0"/>
+              <w:jc w:val="left"/>
+            </w:pPr>
+            <w:r>
+              <w:rPr>
+                <w:rFonts w:ascii="Times New Roman" w:hAnsi="Times New Roman"/>
+                <w:b w:val="0"/>
+                <w:sz w:val="24"/>
+              </w:rPr>
+              <w:t>3. Подзаконные акты</w:t>
             </w:r>
           </w:p>
         </w:tc>
         <w:tc>
           <w:tcPr>
-            <w:tcW w:type="dxa" w:w="3742"/>
+            <w:tcW w:type="dxa" w:w="6066"/>
             <w:vAlign w:val="top"/>
           </w:tcPr>
           <w:p>
             <w:pPr>
-              <w:spacing w:line="360" w:lineRule="auto" w:after="0"/>
+              <w:spacing w:line="360" w:lineRule="auto" w:before="0" w:after="0"/>
               <w:ind w:firstLine="0"/>
               <w:jc w:val="left"/>
             </w:pPr>
             <w:r>
               <w:rPr>
-                <w:rFonts w:ascii="Times New Roman" w:hAnsi="Times New Roman" w:cs="Times New Roman" w:eastAsia="Times New Roman"/>
+                <w:rFonts w:ascii="Times New Roman" w:hAnsi="Times New Roman"/>
                 <w:b w:val="0"/>
-                <w:i w:val="0"/>
-                <w:color w:val="000000"/>
                 <w:sz w:val="24"/>
-                <w:lang w:val="ru-RU"/>
               </w:rPr>
-              <w:t>Возможна добровольная сертификация СМИБ. Сам стандарт не обязывает сертифицироваться и не заменяет аттестацию информационной системы.</w:t>
+              <w:t>Постановление Правительства РФ от 01.11.2012 № 1119 «Об утверждении требований к защите персональных данных при их обработке в информационных системах персональных данных» [6].</w:t>
             </w:r>
           </w:p>
         </w:tc>
         <w:tc>
           <w:tcPr>
-            <w:tcW w:type="dxa" w:w="3742"/>
+            <w:tcW w:type="dxa" w:w="1871"/>
             <w:vAlign w:val="top"/>
           </w:tcPr>
           <w:p>
             <w:pPr>
-              <w:spacing w:line="360" w:lineRule="auto" w:after="0"/>
+              <w:spacing w:line="360" w:lineRule="auto" w:before="0" w:after="0"/>
               <w:ind w:firstLine="0"/>
               <w:jc w:val="left"/>
             </w:pPr>
             <w:r>
               <w:rPr>
-                <w:rFonts w:ascii="Times New Roman" w:hAnsi="Times New Roman" w:cs="Times New Roman" w:eastAsia="Times New Roman"/>
+                <w:rFonts w:ascii="Times New Roman" w:hAnsi="Times New Roman"/>
                 <w:b w:val="0"/>
-                <w:i w:val="0"/>
-                <w:color w:val="000000"/>
                 <w:sz w:val="24"/>
-                <w:lang w:val="ru-RU"/>
               </w:rPr>
-              <w:t>Предусматривал аттестацию ГИС до ввода в действие, применение средств защиты, прошедших оценку соответствия, в установленных случаях — сертифицированных.</w:t>
+              <w:t>Защита ПДн.</w:t>
+            </w:r>
+          </w:p>
+        </w:tc>
+      </w:tr>
+      <w:tr>
+        <w:trPr>
+          <w:cantSplit/>
+        </w:trPr>
+        <w:tc>
+          <w:tcPr>
+            <w:tcW w:type="dxa" w:w="1417"/>
+            <w:vAlign w:val="top"/>
+          </w:tcPr>
+          <w:p>
+            <w:pPr>
+              <w:spacing w:line="360" w:lineRule="auto" w:before="0" w:after="0"/>
+              <w:ind w:firstLine="0"/>
+              <w:jc w:val="left"/>
+            </w:pPr>
+            <w:r>
+              <w:rPr>
+                <w:rFonts w:ascii="Times New Roman" w:hAnsi="Times New Roman"/>
+                <w:b w:val="0"/>
+                <w:sz w:val="24"/>
+              </w:rPr>
+              <w:t>4. Акты ведомств</w:t>
+            </w:r>
+          </w:p>
+        </w:tc>
+        <w:tc>
+          <w:tcPr>
+            <w:tcW w:type="dxa" w:w="6066"/>
+            <w:vAlign w:val="top"/>
+          </w:tcPr>
+          <w:p>
+            <w:pPr>
+              <w:spacing w:line="360" w:lineRule="auto" w:before="0" w:after="0"/>
+              <w:ind w:firstLine="0"/>
+              <w:jc w:val="left"/>
+            </w:pPr>
+            <w:r>
+              <w:rPr>
+                <w:rFonts w:ascii="Times New Roman" w:hAnsi="Times New Roman"/>
+                <w:b w:val="0"/>
+                <w:sz w:val="24"/>
+              </w:rPr>
+              <w:t>Приказ ФСТЭК России от 18.02.2013 № 21 «Об утверждении Состава и содержания организационных и технических мер по обеспечению безопасности персональных данных при их обработке в информационных системах персональных данных» [7].</w:t>
+            </w:r>
+          </w:p>
+        </w:tc>
+        <w:tc>
+          <w:tcPr>
+            <w:tcW w:type="dxa" w:w="1871"/>
+            <w:vAlign w:val="top"/>
+          </w:tcPr>
+          <w:p>
+            <w:pPr>
+              <w:spacing w:line="360" w:lineRule="auto" w:before="0" w:after="0"/>
+              <w:ind w:firstLine="0"/>
+              <w:jc w:val="left"/>
+            </w:pPr>
+            <w:r>
+              <w:rPr>
+                <w:rFonts w:ascii="Times New Roman" w:hAnsi="Times New Roman"/>
+                <w:b w:val="0"/>
+                <w:sz w:val="24"/>
+              </w:rPr>
+              <w:t>Меры защиты ИСПДн.</w:t>
+            </w:r>
+          </w:p>
+        </w:tc>
+      </w:tr>
+      <w:tr>
+        <w:trPr>
+          <w:cantSplit/>
+        </w:trPr>
+        <w:tc>
+          <w:tcPr>
+            <w:tcW w:type="dxa" w:w="1417"/>
+            <w:vAlign w:val="top"/>
+          </w:tcPr>
+          <w:p>
+            <w:pPr>
+              <w:spacing w:line="360" w:lineRule="auto" w:before="0" w:after="0"/>
+              <w:ind w:firstLine="0"/>
+              <w:jc w:val="left"/>
+            </w:pPr>
+            <w:r>
+              <w:rPr>
+                <w:rFonts w:ascii="Times New Roman" w:hAnsi="Times New Roman"/>
+                <w:b w:val="0"/>
+                <w:sz w:val="24"/>
+              </w:rPr>
+              <w:t>4. Акты ведомств</w:t>
+            </w:r>
+          </w:p>
+        </w:tc>
+        <w:tc>
+          <w:tcPr>
+            <w:tcW w:type="dxa" w:w="6066"/>
+            <w:vAlign w:val="top"/>
+          </w:tcPr>
+          <w:p>
+            <w:pPr>
+              <w:spacing w:line="360" w:lineRule="auto" w:before="0" w:after="0"/>
+              <w:ind w:firstLine="0"/>
+              <w:jc w:val="left"/>
+            </w:pPr>
+            <w:r>
+              <w:rPr>
+                <w:rFonts w:ascii="Times New Roman" w:hAnsi="Times New Roman"/>
+                <w:b w:val="0"/>
+                <w:sz w:val="24"/>
+              </w:rPr>
+              <w:t>Приказ ФСТЭК России от 11.04.2025 № 117 «Об утверждении Требований о защите информации, содержащейся в государственных информационных системах, иных информационных системах государственных органов, государственных унитарных предприятий, государственных учреждений» [8].</w:t>
+            </w:r>
+          </w:p>
+        </w:tc>
+        <w:tc>
+          <w:tcPr>
+            <w:tcW w:type="dxa" w:w="1871"/>
+            <w:vAlign w:val="top"/>
+          </w:tcPr>
+          <w:p>
+            <w:pPr>
+              <w:spacing w:line="360" w:lineRule="auto" w:before="0" w:after="0"/>
+              <w:ind w:firstLine="0"/>
+              <w:jc w:val="left"/>
+            </w:pPr>
+            <w:r>
+              <w:rPr>
+                <w:rFonts w:ascii="Times New Roman" w:hAnsi="Times New Roman"/>
+                <w:b w:val="0"/>
+                <w:sz w:val="24"/>
+              </w:rPr>
+              <w:t>Защита ГИС и иных гос. ИС.</w:t>
+            </w:r>
+          </w:p>
+        </w:tc>
+      </w:tr>
+      <w:tr>
+        <w:trPr>
+          <w:cantSplit/>
+        </w:trPr>
+        <w:tc>
+          <w:tcPr>
+            <w:tcW w:type="dxa" w:w="1417"/>
+            <w:vAlign w:val="top"/>
+          </w:tcPr>
+          <w:p>
+            <w:pPr>
+              <w:spacing w:line="360" w:lineRule="auto" w:before="0" w:after="0"/>
+              <w:ind w:firstLine="0"/>
+              <w:jc w:val="left"/>
+            </w:pPr>
+            <w:r>
+              <w:rPr>
+                <w:rFonts w:ascii="Times New Roman" w:hAnsi="Times New Roman"/>
+                <w:b w:val="0"/>
+                <w:sz w:val="24"/>
+              </w:rPr>
+              <w:t>5. Стандарты</w:t>
+            </w:r>
+          </w:p>
+        </w:tc>
+        <w:tc>
+          <w:tcPr>
+            <w:tcW w:type="dxa" w:w="6066"/>
+            <w:vAlign w:val="top"/>
+          </w:tcPr>
+          <w:p>
+            <w:pPr>
+              <w:spacing w:line="360" w:lineRule="auto" w:before="0" w:after="0"/>
+              <w:ind w:firstLine="0"/>
+              <w:jc w:val="left"/>
+            </w:pPr>
+            <w:r>
+              <w:rPr>
+                <w:rFonts w:ascii="Times New Roman" w:hAnsi="Times New Roman"/>
+                <w:b w:val="0"/>
+                <w:sz w:val="24"/>
+              </w:rPr>
+              <w:t>ГОСТ Р 50922-2006 «Защита информации. Основные термины и определения».</w:t>
+            </w:r>
+          </w:p>
+        </w:tc>
+        <w:tc>
+          <w:tcPr>
+            <w:tcW w:type="dxa" w:w="1871"/>
+            <w:vAlign w:val="top"/>
+          </w:tcPr>
+          <w:p>
+            <w:pPr>
+              <w:spacing w:line="360" w:lineRule="auto" w:before="0" w:after="0"/>
+              <w:ind w:firstLine="0"/>
+              <w:jc w:val="left"/>
+            </w:pPr>
+            <w:r>
+              <w:rPr>
+                <w:rFonts w:ascii="Times New Roman" w:hAnsi="Times New Roman"/>
+                <w:b w:val="0"/>
+                <w:sz w:val="24"/>
+              </w:rPr>
+              <w:t>Терминология ИБ.</w:t>
+            </w:r>
+          </w:p>
+        </w:tc>
+      </w:tr>
+      <w:tr>
+        <w:trPr>
+          <w:cantSplit/>
+        </w:trPr>
+        <w:tc>
+          <w:tcPr>
+            <w:tcW w:type="dxa" w:w="1417"/>
+            <w:vAlign w:val="top"/>
+          </w:tcPr>
+          <w:p>
+            <w:pPr>
+              <w:spacing w:line="360" w:lineRule="auto" w:before="0" w:after="0"/>
+              <w:ind w:firstLine="0"/>
+              <w:jc w:val="left"/>
+            </w:pPr>
+            <w:r>
+              <w:rPr>
+                <w:rFonts w:ascii="Times New Roman" w:hAnsi="Times New Roman"/>
+                <w:b w:val="0"/>
+                <w:sz w:val="24"/>
+              </w:rPr>
+              <w:t>5. Стандарты</w:t>
+            </w:r>
+          </w:p>
+        </w:tc>
+        <w:tc>
+          <w:tcPr>
+            <w:tcW w:type="dxa" w:w="6066"/>
+            <w:vAlign w:val="top"/>
+          </w:tcPr>
+          <w:p>
+            <w:pPr>
+              <w:spacing w:line="360" w:lineRule="auto" w:before="0" w:after="0"/>
+              <w:ind w:firstLine="0"/>
+              <w:jc w:val="left"/>
+            </w:pPr>
+            <w:r>
+              <w:rPr>
+                <w:rFonts w:ascii="Times New Roman" w:hAnsi="Times New Roman"/>
+                <w:b w:val="0"/>
+                <w:sz w:val="24"/>
+              </w:rPr>
+              <w:t>ГОСТ Р ИСО/МЭК 27001-2021 «Информационная технология. Методы и средства обеспечения безопасности. Системы менеджмента информационной безопасности. Требования».</w:t>
+            </w:r>
+          </w:p>
+        </w:tc>
+        <w:tc>
+          <w:tcPr>
+            <w:tcW w:type="dxa" w:w="1871"/>
+            <w:vAlign w:val="top"/>
+          </w:tcPr>
+          <w:p>
+            <w:pPr>
+              <w:spacing w:line="360" w:lineRule="auto" w:before="0" w:after="0"/>
+              <w:ind w:firstLine="0"/>
+              <w:jc w:val="left"/>
+            </w:pPr>
+            <w:r>
+              <w:rPr>
+                <w:rFonts w:ascii="Times New Roman" w:hAnsi="Times New Roman"/>
+                <w:b w:val="0"/>
+                <w:sz w:val="24"/>
+              </w:rPr>
+              <w:t>Построение и улучшение СМИБ.</w:t>
             </w:r>
           </w:p>
         </w:tc>
       </w:tr>
     </w:tbl>
     <w:p>
+      <w:pPr>
+        <w:keepNext/>
+        <w:pageBreakBefore/>
+        <w:spacing w:before="0" w:after="0"/>
+      </w:pPr>
       <w:r>
-        <w:br w:type="page"/>
+        <w:rPr>
+          <w:rFonts w:ascii="Times New Roman" w:hAnsi="Times New Roman" w:eastAsia="Times New Roman"/>
+          <w:b/>
+          <w:color w:val="000000"/>
+          <w:sz w:val="28"/>
+        </w:rPr>
+        <w:t>3 Анализ закона и выводы</w:t>
       </w:r>
     </w:p>
     <w:p>
       <w:pPr>
         <w:keepNext/>
-        <w:spacing w:line="360" w:lineRule="auto" w:before="0" w:after="0"/>
-        <w:ind w:firstLine="709" w:left="0" w:right="0"/>
-        <w:jc w:val="both"/>
+        <w:spacing w:before="0" w:after="0"/>
       </w:pPr>
       <w:r>
         <w:rPr>
-          <w:rFonts w:ascii="Times New Roman" w:hAnsi="Times New Roman" w:cs="Times New Roman" w:eastAsia="Times New Roman"/>
+          <w:rFonts w:ascii="Times New Roman" w:hAnsi="Times New Roman" w:eastAsia="Times New Roman"/>
           <w:b/>
-          <w:i w:val="0"/>
           <w:color w:val="000000"/>
           <w:sz w:val="28"/>
-          <w:lang w:val="ru-RU"/>
         </w:rPr>
-        <w:t>4 Выводы</w:t>
+        <w:t>Задание 2. Статьи Федерального закона № 149-ФЗ</w:t>
       </w:r>
     </w:p>
     <w:p>
       <w:pPr>
         <w:keepNext w:val="0"/>
-        <w:spacing w:line="360" w:lineRule="auto" w:before="0" w:after="0"/>
-        <w:ind w:firstLine="709" w:left="0" w:right="0"/>
-        <w:jc w:val="both"/>
+        <w:spacing w:before="0" w:after="0"/>
       </w:pPr>
       <w:r>
         <w:rPr>
-          <w:rFonts w:ascii="Times New Roman" w:hAnsi="Times New Roman" w:cs="Times New Roman" w:eastAsia="Times New Roman"/>
+          <w:rFonts w:ascii="Times New Roman" w:hAnsi="Times New Roman" w:eastAsia="Times New Roman"/>
           <w:b w:val="0"/>
-          <w:i w:val="0"/>
           <w:color w:val="000000"/>
           <w:sz w:val="28"/>
-          <w:lang w:val="ru-RU"/>
         </w:rPr>
-        <w:t>Задание 3. Стандарт описывает управление ИБ на основе рисков, а приказ № 17 устанавливал обязательные требования к защите ГИС. СМИБ применима и в частной компании, и в госоргане; приказ № 17 не распространялся автоматически на любую ИСПДн или систему КИИ. Подходы дополняют друг друга: сертификат СМИБ не заменяет выполнение закона и аттестацию [4, 5].</w:t>
+        <w:t>а) Статья 8, часть 1: граждане и организации вправе искать и получать информацию в любых формах и из любых источников с соблюдением закона. Часть 4 перечисляет сведения, доступ к которым нельзя ограничивать [3].</w:t>
       </w:r>
     </w:p>
     <w:p>
       <w:pPr>
         <w:keepNext w:val="0"/>
-        <w:spacing w:line="360" w:lineRule="auto" w:before="0" w:after="0"/>
-        <w:ind w:firstLine="709" w:left="0" w:right="0"/>
-        <w:jc w:val="both"/>
+        <w:spacing w:before="0" w:after="0"/>
       </w:pPr>
       <w:r>
         <w:rPr>
-          <w:rFonts w:ascii="Times New Roman" w:hAnsi="Times New Roman" w:cs="Times New Roman" w:eastAsia="Times New Roman"/>
+          <w:rFonts w:ascii="Times New Roman" w:hAnsi="Times New Roman" w:eastAsia="Times New Roman"/>
           <w:b w:val="0"/>
-          <w:i w:val="0"/>
           <w:color w:val="000000"/>
           <w:sz w:val="28"/>
-          <w:lang w:val="ru-RU"/>
         </w:rPr>
-        <w:t>Задание 4. Отчёт оформлен по разделу 4 методички с учётом ГОСТ 7.32-2017 [2, 8].</w:t>
+        <w:t>б) Статья 16, часть 4: в установленных законом случаях обладатель и оператор обязаны предотвращать и обнаруживать НСД, предупреждать его последствия, защищать функционирование техники, восстанавливать сведения и постоянно контролировать защищённость; п. 7 требует нахождения в РФ баз данных для перечисленных операций с ПДн граждан РФ [3].</w:t>
+      </w:r>
+    </w:p>
+    <w:p>
+      <w:pPr>
+        <w:keepNext w:val="0"/>
+        <w:spacing w:before="0" w:after="0"/>
+      </w:pPr>
+      <w:r>
+        <w:rPr>
+          <w:rFonts w:ascii="Times New Roman" w:hAnsi="Times New Roman" w:eastAsia="Times New Roman"/>
+          <w:b w:val="0"/>
+          <w:color w:val="000000"/>
+          <w:sz w:val="28"/>
+        </w:rPr>
+        <w:t>в) Статья 9, части 1–2: ограничение доступа устанавливается федеральными законами для перечисленных публичных целей; конфиденциальность ограниченной в доступе информации обязательна [3]. Это краткое изложение, не дословная цитата.</w:t>
       </w:r>
     </w:p>
     <w:p>
       <w:pPr>
         <w:keepNext/>
-        <w:spacing w:line="360" w:lineRule="auto" w:before="0" w:after="0"/>
-        <w:ind w:firstLine="709" w:left="0" w:right="0"/>
-        <w:jc w:val="both"/>
+        <w:spacing w:before="0" w:after="0"/>
       </w:pPr>
       <w:r>
         <w:rPr>
-          <w:rFonts w:ascii="Times New Roman" w:hAnsi="Times New Roman" w:cs="Times New Roman" w:eastAsia="Times New Roman"/>
+          <w:rFonts w:ascii="Times New Roman" w:hAnsi="Times New Roman" w:eastAsia="Times New Roman"/>
           <w:b/>
-          <w:i w:val="0"/>
           <w:color w:val="000000"/>
           <w:sz w:val="28"/>
-          <w:lang w:val="ru-RU"/>
         </w:rPr>
-        <w:t>5 Ответы на контрольные вопросы</w:t>
+        <w:t>Задания 3–4. Вывод и оформление</w:t>
       </w:r>
     </w:p>
     <w:p>
       <w:pPr>
         <w:keepNext w:val="0"/>
-        <w:spacing w:line="360" w:lineRule="auto" w:before="0" w:after="0"/>
-        <w:ind w:firstLine="709" w:left="0" w:right="0"/>
-        <w:jc w:val="both"/>
+        <w:spacing w:before="0" w:after="0"/>
       </w:pPr>
       <w:r>
         <w:rPr>
-          <w:rFonts w:ascii="Times New Roman" w:hAnsi="Times New Roman" w:cs="Times New Roman" w:eastAsia="Times New Roman"/>
+          <w:rFonts w:ascii="Times New Roman" w:hAnsi="Times New Roman" w:eastAsia="Times New Roman"/>
           <w:b w:val="0"/>
-          <w:i w:val="0"/>
           <w:color w:val="000000"/>
           <w:sz w:val="28"/>
-          <w:lang w:val="ru-RU"/>
         </w:rPr>
-        <w:t>1) Иерархия документов. Конституция РФ и федеральные законы имеют приоритет перед подзаконными актами: указами Президента, постановлениями Правительства и ведомственными актами. Стандарты — отдельная нормативно-техническая система; международный стандарт сам по себе не становится обязательным правовым актом РФ [1, 3].</w:t>
+        <w:t>Регулятор действует в пределах закона: ведомственный акт не может изменять федеральный закон (ст. 15, 76 Конституции). ГОСТ обязателен в предусмотренных законом случаях и пределах нормативной ссылки; договор делает его требования обязательствами сторон. Публичное заявление о соответствии также влечёт обязанность соблюдать стандарт (ст. 26 закона № 162-ФЗ) [2, 9]. Оформление — по методичке и ГОСТ 7.32-2017 [1].</w:t>
+      </w:r>
+    </w:p>
+    <w:p>
+      <w:pPr>
+        <w:keepNext/>
+        <w:spacing w:before="0" w:after="0"/>
+      </w:pPr>
+      <w:r>
+        <w:rPr>
+          <w:rFonts w:ascii="Times New Roman" w:hAnsi="Times New Roman" w:eastAsia="Times New Roman"/>
+          <w:b/>
+          <w:color w:val="000000"/>
+          <w:sz w:val="28"/>
+        </w:rPr>
+        <w:t>Ответы на контрольные вопросы</w:t>
       </w:r>
     </w:p>
     <w:p>
       <w:pPr>
         <w:keepNext w:val="0"/>
-        <w:spacing w:line="360" w:lineRule="auto" w:before="0" w:after="0"/>
-        <w:ind w:firstLine="709" w:left="0" w:right="0"/>
-        <w:jc w:val="both"/>
+        <w:spacing w:before="0" w:after="0"/>
       </w:pPr>
       <w:r>
         <w:rPr>
-          <w:rFonts w:ascii="Times New Roman" w:hAnsi="Times New Roman" w:cs="Times New Roman" w:eastAsia="Times New Roman"/>
+          <w:rFonts w:ascii="Times New Roman" w:hAnsi="Times New Roman" w:eastAsia="Times New Roman"/>
           <w:b w:val="0"/>
-          <w:i w:val="0"/>
           <w:color w:val="000000"/>
           <w:sz w:val="28"/>
-          <w:lang w:val="ru-RU"/>
         </w:rPr>
-        <w:t>2) Обязательные и добровольные требования. Акт регулятора обязателен в установленной области; стандарт обычно выбирают добровольно. Если его требования включены в договор или обязательную норму, возникает соответствующая обязанность. Добровольность не означает возможность произвольно заявлять соответствие [4, 5].</w:t>
+        <w:t>1) Иерархия: Конституция → законы → подзаконные акты; стандарты — отдельная система. 2) Базовый закон — № 149-ФЗ. 3) ФСТЭК — техническая защита; ФСБ — криптографическая защита; Роскомнадзор — надзор за ПДн. 4) ГОСТ обычно доброволен; исключения описаны в выводе. 5) Приватность: ст. 23–24; информационные права: ст. 29 Конституции [2–4, 9].</w:t>
+      </w:r>
+    </w:p>
+    <w:p>
+      <w:pPr>
+        <w:keepNext/>
+        <w:pageBreakBefore/>
+        <w:spacing w:before="0" w:after="0"/>
+      </w:pPr>
+      <w:r>
+        <w:rPr>
+          <w:rFonts w:ascii="Times New Roman" w:hAnsi="Times New Roman" w:eastAsia="Times New Roman"/>
+          <w:b/>
+          <w:color w:val="000000"/>
+          <w:sz w:val="28"/>
+        </w:rPr>
+        <w:t>4 Перечень использованных источников</w:t>
       </w:r>
     </w:p>
     <w:p>
       <w:pPr>
         <w:keepNext w:val="0"/>
-        <w:spacing w:line="360" w:lineRule="auto" w:before="0" w:after="0"/>
-        <w:ind w:firstLine="709" w:left="0" w:right="0"/>
-        <w:jc w:val="both"/>
+        <w:spacing w:before="0" w:after="0"/>
       </w:pPr>
       <w:r>
         <w:rPr>
-          <w:rFonts w:ascii="Times New Roman" w:hAnsi="Times New Roman" w:cs="Times New Roman" w:eastAsia="Times New Roman"/>
+          <w:rFonts w:ascii="Times New Roman" w:hAnsi="Times New Roman" w:eastAsia="Times New Roman"/>
           <w:b w:val="0"/>
-          <w:i w:val="0"/>
           <w:color w:val="000000"/>
           <w:sz w:val="28"/>
-          <w:lang w:val="ru-RU"/>
         </w:rPr>
-        <w:t>3) Требования к СМИБ. В рамках задания — ГОСТ Р ИСО/МЭК 27001-2021 (ISO/IEC 27001:2013, IDT): контекст, лидерство, планирование, обеспечение, деятельность, оценка результатов и улучшение [5].</w:t>
+        <w:t>1. Лекции.docx; Практические_работы__Методичка (2).docx, работа № 2; ГОСТ 7.32-2017 «Отчёт о научно-исследовательской работе. Структура и правила оформления».</w:t>
       </w:r>
     </w:p>
     <w:p>
       <w:pPr>
         <w:keepNext w:val="0"/>
-        <w:spacing w:line="360" w:lineRule="auto" w:before="0" w:after="0"/>
-        <w:ind w:firstLine="709" w:left="0" w:right="0"/>
-        <w:jc w:val="both"/>
+        <w:spacing w:before="0" w:after="0"/>
       </w:pPr>
       <w:r>
         <w:rPr>
-          <w:rFonts w:ascii="Times New Roman" w:hAnsi="Times New Roman" w:cs="Times New Roman" w:eastAsia="Times New Roman"/>
+          <w:rFonts w:ascii="Times New Roman" w:hAnsi="Times New Roman" w:eastAsia="Times New Roman"/>
           <w:b w:val="0"/>
-          <w:i w:val="0"/>
           <w:color w:val="000000"/>
           <w:sz w:val="28"/>
-          <w:lang w:val="ru-RU"/>
         </w:rPr>
-        <w:t>4) Защита информации в ГИС. В историческом контексте задания — приказ ФСТЭК России от 11.02.2013 № 17; на дату отчёта, 05.10.2026, действует заменивший его приказ от 11.04.2025 № 117 [4, 9].</w:t>
+        <w:t>2. Конституция Российской Федерации (принята 12.12.1993), ст. 15, 23, 24, 29, 76.</w:t>
       </w:r>
     </w:p>
     <w:p>
       <w:pPr>
         <w:keepNext w:val="0"/>
-        <w:spacing w:line="360" w:lineRule="auto" w:before="0" w:after="0"/>
-        <w:ind w:firstLine="709" w:left="0" w:right="0"/>
-        <w:jc w:val="both"/>
+        <w:spacing w:before="0" w:after="0"/>
       </w:pPr>
       <w:r>
         <w:rPr>
-          <w:rFonts w:ascii="Times New Roman" w:hAnsi="Times New Roman" w:cs="Times New Roman" w:eastAsia="Times New Roman"/>
+          <w:rFonts w:ascii="Times New Roman" w:hAnsi="Times New Roman" w:eastAsia="Times New Roman"/>
           <w:b w:val="0"/>
-          <w:i w:val="0"/>
           <w:color w:val="000000"/>
           <w:sz w:val="28"/>
-          <w:lang w:val="ru-RU"/>
         </w:rPr>
-        <w:t>5) Оформление. ГОСТ 7.32-2017 и методичка: А4; поля 30/15/20/20 мм; Times New Roman 14 пт, в таблице 12 пт; интервал 1,5; отступ 1,25 см; основной текст по ширине. Номера страниц — снизу по центру, титульный лист учитывается без номера; заголовки — полужирные, без точки, ссылки — в квадратных скобках. Объём 3–5 страниц и точные размеры шрифта конкретизированы методичкой [2, 8].</w:t>
-      </w:r>
-    </w:p>
-    <w:p>
-      <w:r>
-        <w:br w:type="page"/>
-      </w:r>
-    </w:p>
-    <w:p>
-      <w:pPr>
-        <w:keepNext/>
-        <w:spacing w:line="360" w:lineRule="auto" w:before="0" w:after="0"/>
-        <w:ind w:firstLine="709" w:left="0" w:right="0"/>
-        <w:jc w:val="both"/>
-      </w:pPr>
-      <w:r>
-        <w:rPr>
-          <w:rFonts w:ascii="Times New Roman" w:hAnsi="Times New Roman" w:cs="Times New Roman" w:eastAsia="Times New Roman"/>
-          <w:b/>
-          <w:i w:val="0"/>
-          <w:color w:val="000000"/>
-          <w:sz w:val="28"/>
-          <w:lang w:val="ru-RU"/>
-        </w:rPr>
-        <w:t>6 Перечень использованных источников</w:t>
+        <w:t>3. Федеральный закон от 27.07.2006 № 149-ФЗ «Об информации, информационных технологиях и о защите информации», ст. 8, 9, 16 (ред. 26.06.2026, действует с 01.09.2026). URL: https://normativ.kontur.ru/document?moduleId=1&amp;documentId=506841.</w:t>
       </w:r>
     </w:p>
     <w:p>
       <w:pPr>
         <w:keepNext w:val="0"/>
-        <w:spacing w:line="360" w:lineRule="auto" w:before="0" w:after="0"/>
-        <w:ind w:firstLine="709" w:left="0" w:right="0"/>
-        <w:jc w:val="both"/>
+        <w:spacing w:before="0" w:after="0"/>
       </w:pPr>
       <w:r>
         <w:rPr>
-          <w:rFonts w:ascii="Times New Roman" w:hAnsi="Times New Roman" w:cs="Times New Roman" w:eastAsia="Times New Roman"/>
+          <w:rFonts w:ascii="Times New Roman" w:hAnsi="Times New Roman" w:eastAsia="Times New Roman"/>
           <w:b w:val="0"/>
-          <w:i w:val="0"/>
           <w:color w:val="000000"/>
           <w:sz w:val="28"/>
-          <w:lang w:val="ru-RU"/>
         </w:rPr>
-        <w:t>1. Лекции по дисциплине. Учебный материал из репозитория: Лекции.docx.</w:t>
+        <w:t>4. Федеральный закон от 27.07.2006 № 152-ФЗ «О персональных данных».</w:t>
       </w:r>
     </w:p>
     <w:p>
       <w:pPr>
         <w:keepNext w:val="0"/>
-        <w:spacing w:line="360" w:lineRule="auto" w:before="0" w:after="0"/>
-        <w:ind w:firstLine="709" w:left="0" w:right="0"/>
-        <w:jc w:val="both"/>
+        <w:spacing w:before="0" w:after="0"/>
       </w:pPr>
       <w:r>
         <w:rPr>
-          <w:rFonts w:ascii="Times New Roman" w:hAnsi="Times New Roman" w:cs="Times New Roman" w:eastAsia="Times New Roman"/>
+          <w:rFonts w:ascii="Times New Roman" w:hAnsi="Times New Roman" w:eastAsia="Times New Roman"/>
           <w:b w:val="0"/>
-          <w:i w:val="0"/>
           <w:color w:val="000000"/>
           <w:sz w:val="28"/>
-          <w:lang w:val="ru-RU"/>
         </w:rPr>
-        <w:t>2. Практическая работа № 2. Методические указания. Учебный материал: Практическая_работа_2_Методичка.docx.</w:t>
+        <w:t>5. Указ Президента РФ от 05.12.2016 № 646 «Об утверждении Доктрины информационной безопасности Российской Федерации».</w:t>
       </w:r>
     </w:p>
     <w:p>
       <w:pPr>
         <w:keepNext w:val="0"/>
-        <w:spacing w:line="360" w:lineRule="auto" w:before="0" w:after="0"/>
-        <w:ind w:firstLine="709" w:left="0" w:right="0"/>
-        <w:jc w:val="both"/>
+        <w:spacing w:before="0" w:after="0"/>
       </w:pPr>
       <w:r>
         <w:rPr>
-          <w:rFonts w:ascii="Times New Roman" w:hAnsi="Times New Roman" w:cs="Times New Roman" w:eastAsia="Times New Roman"/>
+          <w:rFonts w:ascii="Times New Roman" w:hAnsi="Times New Roman" w:eastAsia="Times New Roman"/>
           <w:b w:val="0"/>
-          <w:i w:val="0"/>
           <w:color w:val="000000"/>
           <w:sz w:val="28"/>
-          <w:lang w:val="ru-RU"/>
         </w:rPr>
-        <w:t>3. Федеральный закон от 27.07.2006 № 149-ФЗ «Об информации, информационных технологиях и о защите информации».</w:t>
+        <w:t>6. Постановление Правительства РФ от 01.11.2012 № 1119 «Об утверждении требований к защите персональных данных при их обработке в информационных системах персональных данных».</w:t>
       </w:r>
     </w:p>
     <w:p>
       <w:pPr>
         <w:keepNext w:val="0"/>
-        <w:spacing w:line="360" w:lineRule="auto" w:before="0" w:after="0"/>
-        <w:ind w:firstLine="709" w:left="0" w:right="0"/>
-        <w:jc w:val="both"/>
+        <w:spacing w:before="0" w:after="0"/>
       </w:pPr>
       <w:r>
         <w:rPr>
-          <w:rFonts w:ascii="Times New Roman" w:hAnsi="Times New Roman" w:cs="Times New Roman" w:eastAsia="Times New Roman"/>
+          <w:rFonts w:ascii="Times New Roman" w:hAnsi="Times New Roman" w:eastAsia="Times New Roman"/>
           <w:b w:val="0"/>
-          <w:i w:val="0"/>
           <w:color w:val="000000"/>
           <w:sz w:val="28"/>
-          <w:lang w:val="ru-RU"/>
         </w:rPr>
-        <w:t>4. Приказ ФСТЭК России от 11.02.2013 № 17 «Об утверждении Требований о защите информации, не составляющей государственную тайну, содержащейся в государственных информационных системах» (утратил силу с 01.03.2026).</w:t>
+        <w:t>7. Приказ ФСТЭК России от 18.02.2013 № 21 «Об утверждении Состава и содержания организационных и технических мер по обеспечению безопасности персональных данных при их обработке в информационных системах персональных данных».</w:t>
       </w:r>
     </w:p>
     <w:p>
       <w:pPr>
         <w:keepNext w:val="0"/>
-        <w:spacing w:line="360" w:lineRule="auto" w:before="0" w:after="0"/>
-        <w:ind w:firstLine="709" w:left="0" w:right="0"/>
-        <w:jc w:val="both"/>
+        <w:spacing w:before="0" w:after="0"/>
       </w:pPr>
       <w:r>
         <w:rPr>
-          <w:rFonts w:ascii="Times New Roman" w:hAnsi="Times New Roman" w:cs="Times New Roman" w:eastAsia="Times New Roman"/>
+          <w:rFonts w:ascii="Times New Roman" w:hAnsi="Times New Roman" w:eastAsia="Times New Roman"/>
           <w:b w:val="0"/>
-          <w:i w:val="0"/>
           <w:color w:val="000000"/>
           <w:sz w:val="28"/>
-          <w:lang w:val="ru-RU"/>
         </w:rPr>
-        <w:t>5. ГОСТ Р ИСО/МЭК 27001-2021. Информационная технология. Методы и средства обеспечения безопасности. Системы менеджмента информационной безопасности. Требования. URL: https://base.garant.ru/403510768/ (дата обращения: 05.10.2026).</w:t>
+        <w:t>8. Приказ ФСТЭК России от 11.04.2025 № 117 «Об утверждении Требований о защите информации, содержащейся в государственных информационных системах, иных информационных системах государственных органов, государственных унитарных предприятий, государственных учреждений». Текст: https://base.garant.ru/412175328/.</w:t>
       </w:r>
     </w:p>
     <w:p>
       <w:pPr>
         <w:keepNext w:val="0"/>
-        <w:spacing w:line="360" w:lineRule="auto" w:before="0" w:after="0"/>
-        <w:ind w:firstLine="709" w:left="0" w:right="0"/>
-        <w:jc w:val="both"/>
+        <w:spacing w:before="0" w:after="0"/>
       </w:pPr>
       <w:r>
         <w:rPr>
-          <w:rFonts w:ascii="Times New Roman" w:hAnsi="Times New Roman" w:cs="Times New Roman" w:eastAsia="Times New Roman"/>
+          <w:rFonts w:ascii="Times New Roman" w:hAnsi="Times New Roman" w:eastAsia="Times New Roman"/>
           <w:b w:val="0"/>
-          <w:i w:val="0"/>
           <w:color w:val="000000"/>
           <w:sz w:val="28"/>
-          <w:lang w:val="ru-RU"/>
         </w:rPr>
-        <w:t>6. ГОСТ Р 50922-2006. Защита информации. Основные термины и определения.</w:t>
+        <w:t>9. Федеральный закон от 29.06.2015 № 162-ФЗ «О стандартизации в Российской Федерации», ст. 26.</w:t>
       </w:r>
     </w:p>
     <w:p>
       <w:pPr>
         <w:keepNext w:val="0"/>
-        <w:spacing w:line="360" w:lineRule="auto" w:before="0" w:after="0"/>
-        <w:ind w:firstLine="709" w:left="0" w:right="0"/>
-        <w:jc w:val="both"/>
+        <w:spacing w:before="0" w:after="0"/>
       </w:pPr>
       <w:r>
         <w:rPr>
-          <w:rFonts w:ascii="Times New Roman" w:hAnsi="Times New Roman" w:cs="Times New Roman" w:eastAsia="Times New Roman"/>
+          <w:rFonts w:ascii="Times New Roman" w:hAnsi="Times New Roman" w:eastAsia="Times New Roman"/>
           <w:b w:val="0"/>
-          <w:i w:val="0"/>
           <w:color w:val="000000"/>
           <w:sz w:val="28"/>
-          <w:lang w:val="ru-RU"/>
         </w:rPr>
-        <w:t>7. ISO/IEC 27001:2013. Information technology — Security techniques — Information security management systems — Requirements. Международная редакция, идентично принятая в источнике [5].</w:t>
-      </w:r>
-    </w:p>
-    <w:p>
-      <w:pPr>
-        <w:keepNext w:val="0"/>
-        <w:spacing w:line="360" w:lineRule="auto" w:before="0" w:after="0"/>
-        <w:ind w:firstLine="709" w:left="0" w:right="0"/>
-        <w:jc w:val="both"/>
-      </w:pPr>
-      <w:r>
-        <w:rPr>
-          <w:rFonts w:ascii="Times New Roman" w:hAnsi="Times New Roman" w:cs="Times New Roman" w:eastAsia="Times New Roman"/>
-          <w:b w:val="0"/>
-          <w:i w:val="0"/>
-          <w:color w:val="000000"/>
-          <w:sz w:val="28"/>
-          <w:lang w:val="ru-RU"/>
-        </w:rPr>
-        <w:t>8. ГОСТ 7.32-2017. Система стандартов по информации, библиотечному и издательскому делу. Отчёт о научно-исследовательской работе. Структура и правила оформления.</w:t>
-      </w:r>
-    </w:p>
-    <w:p>
-      <w:pPr>
-        <w:keepNext w:val="0"/>
-        <w:spacing w:line="360" w:lineRule="auto" w:before="0" w:after="0"/>
-        <w:ind w:firstLine="709" w:left="0" w:right="0"/>
-        <w:jc w:val="both"/>
-      </w:pPr>
-      <w:r>
-        <w:rPr>
-          <w:rFonts w:ascii="Times New Roman" w:hAnsi="Times New Roman" w:cs="Times New Roman" w:eastAsia="Times New Roman"/>
-          <w:b w:val="0"/>
-          <w:i w:val="0"/>
-          <w:color w:val="000000"/>
-          <w:sz w:val="28"/>
-          <w:lang w:val="ru-RU"/>
-        </w:rPr>
-        <w:t>9. Приказ ФСТЭК России от 11.04.2025 № 117 «Об утверждении Требований о защите информации, содержащейся в государственных информационных системах, иных информационных системах государственных органов, государственных унитарных предприятий, государственных учреждений». URL: https://base.garant.ru/412175328/ (дата обращения: 05.10.2026).</w:t>
+        <w:t>Дата проверки источников: 13.10.2026.</w:t>
       </w:r>
     </w:p>
     <w:sectPr>
@@ -1322,24 +1407,10 @@
   <w:p>
     <w:pPr>
       <w:pStyle w:val="Footer"/>
-      <w:spacing w:before="0" w:after="0" w:line="240" w:lineRule="auto"/>
       <w:ind w:firstLine="0"/>
       <w:jc w:val="center"/>
     </w:pPr>
-    <w:r>
-      <w:rPr>
-        <w:rFonts w:ascii="Times New Roman" w:hAnsi="Times New Roman" w:cs="Times New Roman" w:eastAsia="Times New Roman"/>
-        <w:b w:val="0"/>
-        <w:i w:val="0"/>
-        <w:color w:val="000000"/>
-        <w:sz w:val="28"/>
-        <w:lang w:val="ru-RU"/>
-      </w:rPr>
-      <w:fldChar w:fldCharType="begin"/>
-      <w:instrText xml:space="preserve"> PAGE </w:instrText>
-      <w:fldChar w:fldCharType="separate"/>
-      <w:fldChar w:fldCharType="end"/>
-    </w:r>
+    <w:fldSimple w:instr="PAGE"/>
   </w:p>
 </w:ftr>
 </file>
@@ -1708,7 +1779,9 @@
     <w:qFormat/>
     <w:rsid w:val="00FC693F"/>
     <w:pPr>
-      <w:spacing w:line="360" w:lineRule="auto" w:after="0"/>
+      <w:spacing w:line="360" w:lineRule="auto" w:before="0" w:after="0"/>
+      <w:ind w:firstLine="709"/>
+      <w:jc w:val="both"/>
     </w:pPr>
     <w:rPr>
       <w:rFonts w:ascii="Times New Roman" w:hAnsi="Times New Roman"/>

</xml_diff>